<commit_message>
Update Week12 logbook next steps
</commit_message>
<xml_diff>
--- a/Week12_Logbook_Apr05-Apr11.docx
+++ b/Week12_Logbook_Apr05-Apr11.docx
@@ -101,7 +101,7 @@
           <w:sz-cs w:val="32"/>
           <w:spacing w:val="0"/>
         </w:rPr>
-        <w:t xml:space="preserve">Two tasks are still moving. First, the reminder system already supports repeat, snooze, complete, and status tracking, but the final overdue-reminder rule still needs to be confirmed and polished. Second, the manual create and edit dialogs in the app still need a cleaner way to generate linked items with the same bundle_id used by AI-created planning items. The backend support is mostly there, but the last part of the UI behavior is not fully done yet.</w:t>
+        <w:t xml:space="preserve">Three tasks are still in progress. First, the reminder system already supports repeat, snooze, complete, and status tracking, but the final overdue-reminder rule still needs to be confirmed and polished. Second, the manual create and edit dialogs in the app still need a cleaner way to generate linked items with the same bundle_id used by AI-created planning items. Third, the hardware finishing work is moving into the final stage: I still need to assemble the 3D shell, fit the current hardware into the enclosure, and check whether touch, screen, speaker, power, and cable routing stay stable after assembly. The last product packaging work also belongs to this stage.</w:t>
       </w:r>
     </w:p>
     <w:p>
@@ -130,7 +130,7 @@
           <w:sz-cs w:val="32"/>
           <w:spacing w:val="0"/>
         </w:rPr>
-        <w:t xml:space="preserve">Next week I plan to finish the remaining planning details in the macOS app, especially reminder edge cases and better linked-item creation from the UI. I also need to continue the hardware-related work that is still open, including WS2812B testing and the remaining ESP32 firmware connection tasks. If time allows, I will also reduce the size of some large integration files so future feature work is easier to manage.</w:t>
+        <w:t xml:space="preserve">Next week I plan to finish the remaining planning details in the macOS app, especially reminder edge cases and better linked-item creation from the UI. I also need to continue the hardware-related work that is still open, including WS2812B testing, the remaining ESP32 firmware connection tasks, 3D shell assembly, and the final product packaging work before the next round of presentation and demo use. If time allows, I will also reduce the size of some large integration files so future feature work is easier to manage.</w:t>
       </w:r>
     </w:p>
     <w:p>

</xml_diff>